<commit_message>
add: Plano de Garantia de qualidade e versão dos documentos
fix: checklists nomes e formulas
</commit_message>
<xml_diff>
--- a/Plano_de_Garantia_da_Qualidade.docx
+++ b/Plano_de_Garantia_da_Qualidade.docx
@@ -423,7 +423,7 @@
                 <w:noProof/>
               </w:rPr>
               <w:drawing>
-                <wp:inline distT="0" distB="0" distL="0" distR="0" wp14:anchorId="01C4BC5C" wp14:editId="693ADB1E">
+                <wp:inline distT="0" distB="0" distL="0" distR="0" wp14:anchorId="01C4BC5C" wp14:editId="153D0397">
                   <wp:extent cx="4350385" cy="600070"/>
                   <wp:effectExtent l="0" t="0" r="0" b="0"/>
                   <wp:docPr id="1068986117" name="Imagem 2">
@@ -551,7 +551,7 @@
                 <w:noProof/>
               </w:rPr>
               <w:drawing>
-                <wp:inline distT="0" distB="0" distL="0" distR="0" wp14:anchorId="1B15FA2E" wp14:editId="43C49FFF">
+                <wp:inline distT="0" distB="0" distL="0" distR="0" wp14:anchorId="1B15FA2E" wp14:editId="28F68AF1">
                   <wp:extent cx="2119871" cy="626745"/>
                   <wp:effectExtent l="0" t="0" r="0" b="1905"/>
                   <wp:docPr id="1781707339" name="Imagem 4"/>
@@ -681,7 +681,7 @@
                 <w:noProof/>
               </w:rPr>
               <w:drawing>
-                <wp:inline distT="0" distB="0" distL="0" distR="0" wp14:anchorId="7228B9C5" wp14:editId="3AAAC141">
+                <wp:inline distT="0" distB="0" distL="0" distR="0" wp14:anchorId="7228B9C5" wp14:editId="2492A5FC">
                   <wp:extent cx="1143000" cy="914300"/>
                   <wp:effectExtent l="0" t="0" r="0" b="635"/>
                   <wp:docPr id="2024456677" name="Imagem 6"/>
@@ -806,7 +806,7 @@
                 <w:noProof/>
               </w:rPr>
               <w:drawing>
-                <wp:inline distT="0" distB="0" distL="0" distR="0" wp14:anchorId="61CE1BED" wp14:editId="4E30A159">
+                <wp:inline distT="0" distB="0" distL="0" distR="0" wp14:anchorId="61CE1BED" wp14:editId="311F9B39">
                   <wp:extent cx="3429000" cy="797796"/>
                   <wp:effectExtent l="0" t="0" r="0" b="2540"/>
                   <wp:docPr id="1401919322" name="Imagem 8"/>
@@ -955,7 +955,7 @@
                 <w:noProof/>
               </w:rPr>
               <w:drawing>
-                <wp:inline distT="0" distB="0" distL="0" distR="0" wp14:anchorId="1632F460" wp14:editId="79550869">
+                <wp:inline distT="0" distB="0" distL="0" distR="0" wp14:anchorId="1632F460" wp14:editId="2A3AE994">
                   <wp:extent cx="2438400" cy="886025"/>
                   <wp:effectExtent l="0" t="0" r="0" b="9525"/>
                   <wp:docPr id="527872523" name="Imagem 9"/>
@@ -1215,7 +1215,7 @@
                 <w:noProof/>
               </w:rPr>
               <w:drawing>
-                <wp:inline distT="0" distB="0" distL="0" distR="0" wp14:anchorId="21782D46" wp14:editId="7AA07929">
+                <wp:inline distT="0" distB="0" distL="0" distR="0" wp14:anchorId="21782D46" wp14:editId="56558778">
                   <wp:extent cx="1933575" cy="631069"/>
                   <wp:effectExtent l="0" t="0" r="0" b="0"/>
                   <wp:docPr id="1022342481" name="Imagem 13"/>
@@ -1467,7 +1467,7 @@
         <w:rPr>
           <w:color w:val="000000"/>
         </w:rPr>
-        <w:t>Blaszczak</w:t>
+        <w:t>Blasczak</w:t>
       </w:r>
       <w:proofErr w:type="spellEnd"/>
       <w:r>
@@ -1705,27 +1705,7 @@
           </w:tcPr>
           <w:p>
             <w:r>
-              <w:rPr>
-                <w:sz w:val="20"/>
-                <w:szCs w:val="20"/>
-              </w:rPr>
-              <w:t xml:space="preserve">Especificação do Trabalho – Aplicação Processo de Qualidade (Prof. Kelly </w:t>
-            </w:r>
-            <w:proofErr w:type="spellStart"/>
-            <w:r>
-              <w:rPr>
-                <w:sz w:val="20"/>
-                <w:szCs w:val="20"/>
-              </w:rPr>
-              <w:t>Bettio</w:t>
-            </w:r>
-            <w:proofErr w:type="spellEnd"/>
-            <w:r>
-              <w:rPr>
-                <w:sz w:val="20"/>
-                <w:szCs w:val="20"/>
-              </w:rPr>
-              <w:t>)</w:t>
+              <w:t>RA1 - Relatório de Teste de Usabilidade de Sistema Web</w:t>
             </w:r>
           </w:p>
         </w:tc>
@@ -1734,106 +1714,6 @@
             <w:tcW w:w="2000" w:type="dxa"/>
           </w:tcPr>
           <w:p>
-            <w:r>
-              <w:rPr>
-                <w:sz w:val="20"/>
-                <w:szCs w:val="20"/>
-              </w:rPr>
-              <w:t>28/08/2026</w:t>
-            </w:r>
-          </w:p>
-        </w:tc>
-      </w:tr>
-      <w:tr>
-        <w:tc>
-          <w:tcPr>
-            <w:tcW w:w="7360" w:type="dxa"/>
-          </w:tcPr>
-          <w:p>
-            <w:proofErr w:type="spellStart"/>
-            <w:r>
-              <w:rPr>
-                <w:sz w:val="20"/>
-                <w:szCs w:val="20"/>
-              </w:rPr>
-              <w:t>Template</w:t>
-            </w:r>
-            <w:proofErr w:type="spellEnd"/>
-            <w:r>
-              <w:rPr>
-                <w:sz w:val="20"/>
-                <w:szCs w:val="20"/>
-              </w:rPr>
-              <w:t xml:space="preserve"> Relatório de Teste de Usabilidade de Sistema Web (disciplina de Verificação e Validação)</w:t>
-            </w:r>
-          </w:p>
-        </w:tc>
-        <w:tc>
-          <w:tcPr>
-            <w:tcW w:w="2000" w:type="dxa"/>
-          </w:tcPr>
-          <w:p>
-            <w:r>
-              <w:rPr>
-                <w:sz w:val="20"/>
-                <w:szCs w:val="20"/>
-              </w:rPr>
-              <w:t>28/08/2026</w:t>
-            </w:r>
-          </w:p>
-        </w:tc>
-      </w:tr>
-      <w:tr>
-        <w:tc>
-          <w:tcPr>
-            <w:tcW w:w="7360" w:type="dxa"/>
-          </w:tcPr>
-          <w:p>
-            <w:pPr>
-              <w:tabs>
-                <w:tab w:val="left" w:pos="1176"/>
-              </w:tabs>
-              <w:rPr>
-                <w:sz w:val="20"/>
-                <w:szCs w:val="20"/>
-              </w:rPr>
-            </w:pPr>
-            <w:proofErr w:type="spellStart"/>
-            <w:r>
-              <w:rPr>
-                <w:sz w:val="20"/>
-                <w:szCs w:val="20"/>
-              </w:rPr>
-              <w:t>Template</w:t>
-            </w:r>
-            <w:proofErr w:type="spellEnd"/>
-            <w:r>
-              <w:rPr>
-                <w:sz w:val="20"/>
-                <w:szCs w:val="20"/>
-              </w:rPr>
-              <w:t xml:space="preserve"> Plano de G</w:t>
-            </w:r>
-            <w:r>
-              <w:rPr>
-                <w:sz w:val="20"/>
-                <w:szCs w:val="20"/>
-              </w:rPr>
-              <w:t>arantia da Qualidade</w:t>
-            </w:r>
-          </w:p>
-        </w:tc>
-        <w:tc>
-          <w:tcPr>
-            <w:tcW w:w="2000" w:type="dxa"/>
-          </w:tcPr>
-          <w:p>
-            <w:pPr>
-              <w:rPr>
-                <w:sz w:val="20"/>
-                <w:szCs w:val="20"/>
-              </w:rPr>
-            </w:pPr>
             <w:r>
               <w:rPr>
                 <w:sz w:val="20"/>
@@ -1890,14 +1770,14 @@
         <w:tblLook w:val="04A0" w:firstRow="1" w:lastRow="0" w:firstColumn="1" w:lastColumn="0" w:noHBand="0" w:noVBand="1"/>
       </w:tblPr>
       <w:tblGrid>
-        <w:gridCol w:w="4360"/>
-        <w:gridCol w:w="3300"/>
-        <w:gridCol w:w="1700"/>
+        <w:gridCol w:w="2476"/>
+        <w:gridCol w:w="5584"/>
+        <w:gridCol w:w="1300"/>
       </w:tblGrid>
       <w:tr>
         <w:tc>
           <w:tcPr>
-            <w:tcW w:w="4360" w:type="dxa"/>
+            <w:tcW w:w="2476" w:type="dxa"/>
             <w:shd w:val="clear" w:color="auto" w:fill="D9D9D9"/>
           </w:tcPr>
           <w:p>
@@ -1914,7 +1794,7 @@
         </w:tc>
         <w:tc>
           <w:tcPr>
-            <w:tcW w:w="3300" w:type="dxa"/>
+            <w:tcW w:w="5584" w:type="dxa"/>
             <w:shd w:val="clear" w:color="auto" w:fill="D9D9D9"/>
           </w:tcPr>
           <w:p>
@@ -1931,7 +1811,7 @@
         </w:tc>
         <w:tc>
           <w:tcPr>
-            <w:tcW w:w="1700" w:type="dxa"/>
+            <w:tcW w:w="1300" w:type="dxa"/>
             <w:shd w:val="clear" w:color="auto" w:fill="D9D9D9"/>
           </w:tcPr>
           <w:p>
@@ -1950,15 +1830,15 @@
       <w:tr>
         <w:tc>
           <w:tcPr>
-            <w:tcW w:w="4360" w:type="dxa"/>
-          </w:tcPr>
-          <w:p>
-            <w:r>
-              <w:rPr>
-                <w:sz w:val="20"/>
-                <w:szCs w:val="20"/>
-              </w:rPr>
-              <w:t>Relatório de Teste de Usabilidade do Sistema Web – iFood (.</w:t>
+            <w:tcW w:w="2476" w:type="dxa"/>
+          </w:tcPr>
+          <w:p>
+            <w:r>
+              <w:rPr>
+                <w:sz w:val="20"/>
+                <w:szCs w:val="20"/>
+              </w:rPr>
+              <w:t xml:space="preserve">Relatório de Teste de Usabilidade de Sistema Web - </w:t>
             </w:r>
             <w:proofErr w:type="spellStart"/>
             <w:r>
@@ -1966,7 +1846,7 @@
                 <w:sz w:val="20"/>
                 <w:szCs w:val="20"/>
               </w:rPr>
-              <w:t>docx</w:t>
+              <w:t>Ifood</w:t>
             </w:r>
             <w:proofErr w:type="spellEnd"/>
             <w:r>
@@ -1974,7 +1854,73 @@
                 <w:sz w:val="20"/>
                 <w:szCs w:val="20"/>
               </w:rPr>
-              <w:t xml:space="preserve"> / .</w:t>
+              <w:t xml:space="preserve"> V1</w:t>
+            </w:r>
+            <w:r>
+              <w:rPr>
+                <w:sz w:val="20"/>
+                <w:szCs w:val="20"/>
+              </w:rPr>
+              <w:t>.pdf</w:t>
+            </w:r>
+          </w:p>
+        </w:tc>
+        <w:tc>
+          <w:tcPr>
+            <w:tcW w:w="5584" w:type="dxa"/>
+          </w:tcPr>
+          <w:p>
+            <w:pPr>
+              <w:spacing w:after="150"/>
+            </w:pPr>
+            <w:r>
+              <w:rPr>
+                <w:color w:val="000000"/>
+              </w:rPr>
+              <w:t>https://github.com/eduardoblasczak/PlanoGarantiaQualidade</w:t>
+            </w:r>
+          </w:p>
+        </w:tc>
+        <w:tc>
+          <w:tcPr>
+            <w:tcW w:w="1300" w:type="dxa"/>
+          </w:tcPr>
+          <w:p>
+            <w:r>
+              <w:rPr>
+                <w:sz w:val="20"/>
+                <w:szCs w:val="20"/>
+              </w:rPr>
+              <w:t>Versão</w:t>
+            </w:r>
+            <w:r>
+              <w:rPr>
+                <w:sz w:val="20"/>
+                <w:szCs w:val="20"/>
+              </w:rPr>
+              <w:t xml:space="preserve"> entregue em 28/08/2026</w:t>
+            </w:r>
+          </w:p>
+        </w:tc>
+      </w:tr>
+      <w:tr>
+        <w:tc>
+          <w:tcPr>
+            <w:tcW w:w="2476" w:type="dxa"/>
+          </w:tcPr>
+          <w:p>
+            <w:pPr>
+              <w:rPr>
+                <w:sz w:val="20"/>
+                <w:szCs w:val="20"/>
+              </w:rPr>
+            </w:pPr>
+            <w:r>
+              <w:rPr>
+                <w:sz w:val="20"/>
+                <w:szCs w:val="20"/>
+              </w:rPr>
+              <w:t xml:space="preserve">Relatório de Teste de Usabilidade de Sistema Web - </w:t>
             </w:r>
             <w:proofErr w:type="spellStart"/>
             <w:r>
@@ -1982,7 +1928,7 @@
                 <w:sz w:val="20"/>
                 <w:szCs w:val="20"/>
               </w:rPr>
-              <w:t>pdf</w:t>
+              <w:t>Ifood</w:t>
             </w:r>
             <w:proofErr w:type="spellEnd"/>
             <w:r>
@@ -1990,27 +1936,131 @@
                 <w:sz w:val="20"/>
                 <w:szCs w:val="20"/>
               </w:rPr>
-              <w:t>)</w:t>
-            </w:r>
-          </w:p>
-        </w:tc>
-        <w:tc>
-          <w:tcPr>
-            <w:tcW w:w="3300" w:type="dxa"/>
-          </w:tcPr>
-          <w:p/>
-        </w:tc>
-        <w:tc>
-          <w:tcPr>
-            <w:tcW w:w="1700" w:type="dxa"/>
-          </w:tcPr>
-          <w:p>
-            <w:r>
-              <w:rPr>
-                <w:sz w:val="20"/>
-                <w:szCs w:val="20"/>
-              </w:rPr>
-              <w:t>v. entregue em 28/08/2026</w:t>
+              <w:t xml:space="preserve"> V</w:t>
+            </w:r>
+            <w:r>
+              <w:rPr>
+                <w:sz w:val="20"/>
+                <w:szCs w:val="20"/>
+              </w:rPr>
+              <w:t>2.pdf</w:t>
+            </w:r>
+          </w:p>
+        </w:tc>
+        <w:tc>
+          <w:tcPr>
+            <w:tcW w:w="5584" w:type="dxa"/>
+          </w:tcPr>
+          <w:p>
+            <w:pPr>
+              <w:spacing w:after="150"/>
+            </w:pPr>
+            <w:r>
+              <w:rPr>
+                <w:color w:val="000000"/>
+              </w:rPr>
+              <w:t>https://github.com/eduardoblasczak/PlanoGarantiaQualidade</w:t>
+            </w:r>
+          </w:p>
+        </w:tc>
+        <w:tc>
+          <w:tcPr>
+            <w:tcW w:w="1300" w:type="dxa"/>
+          </w:tcPr>
+          <w:p>
+            <w:pPr>
+              <w:rPr>
+                <w:sz w:val="20"/>
+                <w:szCs w:val="20"/>
+              </w:rPr>
+            </w:pPr>
+            <w:r>
+              <w:rPr>
+                <w:sz w:val="20"/>
+                <w:szCs w:val="20"/>
+              </w:rPr>
+              <w:t>Versão entregue em 04/09/2026</w:t>
+            </w:r>
+          </w:p>
+        </w:tc>
+      </w:tr>
+      <w:tr>
+        <w:tc>
+          <w:tcPr>
+            <w:tcW w:w="2476" w:type="dxa"/>
+          </w:tcPr>
+          <w:p>
+            <w:pPr>
+              <w:rPr>
+                <w:sz w:val="20"/>
+                <w:szCs w:val="20"/>
+              </w:rPr>
+            </w:pPr>
+            <w:r>
+              <w:rPr>
+                <w:sz w:val="20"/>
+                <w:szCs w:val="20"/>
+              </w:rPr>
+              <w:t xml:space="preserve">Relatório de Teste de Usabilidade de Sistema Web - </w:t>
+            </w:r>
+            <w:proofErr w:type="spellStart"/>
+            <w:r>
+              <w:rPr>
+                <w:sz w:val="20"/>
+                <w:szCs w:val="20"/>
+              </w:rPr>
+              <w:t>Ifood</w:t>
+            </w:r>
+            <w:proofErr w:type="spellEnd"/>
+            <w:r>
+              <w:rPr>
+                <w:sz w:val="20"/>
+                <w:szCs w:val="20"/>
+              </w:rPr>
+              <w:t xml:space="preserve"> V</w:t>
+            </w:r>
+            <w:r>
+              <w:rPr>
+                <w:sz w:val="20"/>
+                <w:szCs w:val="20"/>
+              </w:rPr>
+              <w:t>3.pdf</w:t>
+            </w:r>
+          </w:p>
+        </w:tc>
+        <w:tc>
+          <w:tcPr>
+            <w:tcW w:w="5584" w:type="dxa"/>
+          </w:tcPr>
+          <w:p>
+            <w:pPr>
+              <w:spacing w:after="150"/>
+            </w:pPr>
+            <w:r>
+              <w:rPr>
+                <w:color w:val="000000"/>
+              </w:rPr>
+              <w:t>https://github.com/eduardoblasczak/PlanoGarantiaQualidade</w:t>
+            </w:r>
+          </w:p>
+        </w:tc>
+        <w:tc>
+          <w:tcPr>
+            <w:tcW w:w="1300" w:type="dxa"/>
+          </w:tcPr>
+          <w:p>
+            <w:pPr>
+              <w:rPr>
+                <w:sz w:val="20"/>
+                <w:szCs w:val="20"/>
+              </w:rPr>
+            </w:pPr>
+            <w:r>
+              <w:rPr>
+                <w:sz w:val="20"/>
+                <w:szCs w:val="20"/>
+              </w:rPr>
+              <w:t>Versão entregue em 04/09/2026</w:t>
             </w:r>
           </w:p>
         </w:tc>
@@ -2706,17 +2756,6 @@
           <w:color w:val="000000"/>
         </w:rPr>
         <w:t>, responsável pela disciplina de Qualidade de Software, por e-mail, conforme previsto no item 4.2 da especificação do trabalho.</w:t>
-      </w:r>
-    </w:p>
-    <w:p>
-      <w:pPr>
-        <w:spacing w:after="150"/>
-      </w:pPr>
-      <w:r>
-        <w:rPr>
-          <w:color w:val="000000"/>
-        </w:rPr>
-        <w:t>Conforme o item 4.4 da especificação, ao menos uma NC será propositalmente escalonada para a professora, mediante combinação prévia com a equipe avaliada, para fins de demonstração do processo de escalonamento definido neste plano.</w:t>
       </w:r>
     </w:p>
     <w:sectPr>
@@ -3460,6 +3499,7 @@
   <w:style w:type="character" w:default="1" w:styleId="Fontepargpadro">
     <w:name w:val="Default Paragraph Font"/>
     <w:uiPriority w:val="1"/>
+    <w:semiHidden/>
     <w:unhideWhenUsed/>
   </w:style>
   <w:style w:type="table" w:default="1" w:styleId="Tabelanormal">

</xml_diff>